<commit_message>
feat: new project add
</commit_message>
<xml_diff>
--- a/assets/img/doc-pt.docx
+++ b/assets/img/doc-pt.docx
@@ -5,15 +5,15 @@
     <w:p>
       <w:pPr>
         <w:rPr>
-          <w:kern w:val="0"/>
-          <w:lang w:eastAsia="pt-BR"/>
-          <w14:ligatures w14:val="none"/>
-        </w:rPr>
-      </w:pPr>
-      <w:r>
-        <w:rPr>
-          <w:b/>
-          <w:bCs/>
+          <w:color w:val="000000" w:themeColor="text1"/>
+          <w:lang w:eastAsia="pt-BR"/>
+        </w:rPr>
+      </w:pPr>
+      <w:r>
+        <w:rPr>
+          <w:b/>
+          <w:bCs/>
+          <w:color w:val="000000" w:themeColor="text1"/>
           <w:sz w:val="32"/>
           <w:szCs w:val="32"/>
         </w:rPr>
@@ -21,6 +21,7 @@
       </w:r>
       <w:r>
         <w:rPr>
+          <w:color w:val="000000" w:themeColor="text1"/>
           <w:lang w:eastAsia="pt-BR"/>
         </w:rPr>
         <w:br/>
@@ -29,30 +30,35 @@
         <w:rPr>
           <w:b/>
           <w:bCs/>
+          <w:color w:val="000000" w:themeColor="text1"/>
           <w:lang w:eastAsia="pt-BR"/>
         </w:rPr>
         <w:t>Endereço:</w:t>
       </w:r>
       <w:r>
         <w:rPr>
+          <w:color w:val="000000" w:themeColor="text1"/>
           <w:lang w:eastAsia="pt-BR"/>
         </w:rPr>
         <w:t xml:space="preserve"> São Paulo</w:t>
       </w:r>
       <w:r>
         <w:rPr>
+          <w:color w:val="000000" w:themeColor="text1"/>
           <w:lang w:eastAsia="pt-BR"/>
         </w:rPr>
         <w:t xml:space="preserve"> - </w:t>
       </w:r>
       <w:r>
         <w:rPr>
+          <w:color w:val="000000" w:themeColor="text1"/>
           <w:lang w:eastAsia="pt-BR"/>
         </w:rPr>
         <w:t>SP</w:t>
       </w:r>
       <w:r>
         <w:rPr>
+          <w:color w:val="000000" w:themeColor="text1"/>
           <w:lang w:eastAsia="pt-BR"/>
         </w:rPr>
         <w:br/>
@@ -61,18 +67,21 @@
         <w:rPr>
           <w:b/>
           <w:bCs/>
+          <w:color w:val="000000" w:themeColor="text1"/>
           <w:lang w:eastAsia="pt-BR"/>
         </w:rPr>
         <w:t>E-mail:</w:t>
       </w:r>
       <w:r>
         <w:rPr>
+          <w:color w:val="000000" w:themeColor="text1"/>
           <w:lang w:eastAsia="pt-BR"/>
         </w:rPr>
         <w:t xml:space="preserve"> naiarapachecosantos@gmail.com</w:t>
       </w:r>
       <w:r>
         <w:rPr>
+          <w:color w:val="000000" w:themeColor="text1"/>
           <w:lang w:eastAsia="pt-BR"/>
         </w:rPr>
         <w:br/>
@@ -81,99 +90,130 @@
         <w:rPr>
           <w:b/>
           <w:bCs/>
-          <w:kern w:val="0"/>
-          <w:lang w:eastAsia="pt-BR"/>
-          <w14:ligatures w14:val="none"/>
-        </w:rPr>
-        <w:t>GitHub:</w:t>
-      </w:r>
-      <w:r>
-        <w:rPr>
-          <w:kern w:val="0"/>
-          <w:lang w:eastAsia="pt-BR"/>
-          <w14:ligatures w14:val="none"/>
-        </w:rPr>
-        <w:t xml:space="preserve"> [Naiara Pacheco Santos - GitHub] (</w:t>
-      </w:r>
-      <w:proofErr w:type="gramStart"/>
-      <w:r>
-        <w:rPr>
-          <w:kern w:val="0"/>
-          <w:lang w:eastAsia="pt-BR"/>
-          <w14:ligatures w14:val="none"/>
-        </w:rPr>
-        <w:t>https://github.com/</w:t>
-      </w:r>
-      <w:proofErr w:type="spellStart"/>
-      <w:r>
-        <w:rPr>
-          <w:kern w:val="0"/>
-          <w:lang w:eastAsia="pt-BR"/>
-          <w14:ligatures w14:val="none"/>
-        </w:rPr>
-        <w:t>Naiarapacheco</w:t>
-      </w:r>
-      <w:proofErr w:type="spellEnd"/>
-      <w:r>
-        <w:rPr>
-          <w:kern w:val="0"/>
-          <w:lang w:eastAsia="pt-BR"/>
-          <w14:ligatures w14:val="none"/>
-        </w:rPr>
-        <w:t>)</w:t>
-      </w:r>
-      <w:r>
-        <w:rPr>
-          <w:kern w:val="0"/>
-          <w:lang w:eastAsia="pt-BR"/>
-          <w14:ligatures w14:val="none"/>
+          <w:color w:val="000000" w:themeColor="text1"/>
+          <w:lang w:eastAsia="pt-BR"/>
+        </w:rPr>
+        <w:t>Cel.</w:t>
+      </w:r>
+      <w:r>
+        <w:rPr>
+          <w:color w:val="000000" w:themeColor="text1"/>
+          <w:lang w:eastAsia="pt-BR"/>
+        </w:rPr>
+        <w:t xml:space="preserve"> </w:t>
+      </w:r>
+      <w:r>
+        <w:rPr>
+          <w:b/>
+          <w:bCs/>
+          <w:color w:val="000000" w:themeColor="text1"/>
+          <w:lang w:eastAsia="pt-BR"/>
+        </w:rPr>
+        <w:t>:</w:t>
+      </w:r>
+      <w:r>
+        <w:rPr>
+          <w:color w:val="000000" w:themeColor="text1"/>
+          <w:lang w:eastAsia="pt-BR"/>
+        </w:rPr>
+        <w:t>(11) 9 98879-261</w:t>
+      </w:r>
+      <w:r>
+        <w:rPr>
+          <w:color w:val="000000" w:themeColor="text1"/>
+          <w:lang w:eastAsia="pt-BR"/>
+        </w:rPr>
+        <w:t xml:space="preserve">3                                                                                                                                                 </w:t>
+      </w:r>
+      <w:r>
+        <w:rPr>
+          <w:b/>
+          <w:bCs/>
+          <w:color w:val="000000" w:themeColor="text1"/>
+          <w:lang w:eastAsia="pt-BR"/>
+        </w:rPr>
+        <w:t xml:space="preserve">LinkedIn: </w:t>
+      </w:r>
+      <w:hyperlink r:id="rId5" w:history="1">
+        <w:r>
+          <w:rPr>
+            <w:rStyle w:val="Hyperlink"/>
+            <w:color w:val="000000" w:themeColor="text1"/>
+          </w:rPr>
+          <w:t xml:space="preserve">https://www.linkedin.com/in/naiara-pacheco-45891b309                                                                                                                                               </w:t>
+        </w:r>
+      </w:hyperlink>
+      <w:r>
+        <w:rPr>
+          <w:color w:val="000000" w:themeColor="text1"/>
+        </w:rPr>
+        <w:t xml:space="preserve"> </w:t>
+      </w:r>
+      <w:r>
+        <w:rPr>
+          <w:b/>
+          <w:bCs/>
+          <w:color w:val="000000" w:themeColor="text1"/>
+          <w:lang w:eastAsia="pt-BR"/>
+        </w:rPr>
+        <w:t xml:space="preserve">Portfólio: </w:t>
+      </w:r>
+      <w:hyperlink r:id="rId6" w:history="1">
+        <w:r>
+          <w:rPr>
+            <w:rStyle w:val="Hyperlink"/>
+            <w:color w:val="000000" w:themeColor="text1"/>
+            <w:lang w:eastAsia="pt-BR"/>
+          </w:rPr>
+          <w:t>https://portfolio-upweb.netlify.app/</w:t>
+        </w:r>
+      </w:hyperlink>
+      <w:r>
+        <w:rPr>
+          <w:color w:val="000000" w:themeColor="text1"/>
+          <w:lang w:eastAsia="pt-BR"/>
         </w:rPr>
         <w:t xml:space="preserve">   </w:t>
       </w:r>
-      <w:proofErr w:type="gramEnd"/>
-      <w:r>
-        <w:rPr>
-          <w:kern w:val="0"/>
-          <w:lang w:eastAsia="pt-BR"/>
-          <w14:ligatures w14:val="none"/>
-        </w:rPr>
-        <w:t xml:space="preserve">              </w:t>
-      </w:r>
-      <w:r>
-        <w:rPr>
-          <w:b/>
-          <w:bCs/>
-          <w:kern w:val="0"/>
-          <w:lang w:eastAsia="pt-BR"/>
-          <w14:ligatures w14:val="none"/>
-        </w:rPr>
-        <w:t>Portfólio:</w:t>
-      </w:r>
-      <w:r>
-        <w:rPr>
-          <w:b/>
-          <w:bCs/>
-          <w:kern w:val="0"/>
-          <w:lang w:eastAsia="pt-BR"/>
-          <w14:ligatures w14:val="none"/>
-        </w:rPr>
-        <w:t xml:space="preserve"> </w:t>
-      </w:r>
-      <w:r>
-        <w:rPr>
-          <w:kern w:val="0"/>
-          <w:lang w:eastAsia="pt-BR"/>
-          <w14:ligatures w14:val="none"/>
-        </w:rPr>
-        <w:t>https://portfolio-upweb.netlify.app/</w:t>
-      </w:r>
-      <w:r>
-        <w:rPr>
-          <w:kern w:val="0"/>
-          <w:lang w:eastAsia="pt-BR"/>
-          <w14:ligatures w14:val="none"/>
-        </w:rPr>
-        <w:t xml:space="preserve">                </w:t>
+      <w:r>
+        <w:rPr>
+          <w:color w:val="000000" w:themeColor="text1"/>
+          <w:lang w:eastAsia="pt-BR"/>
+        </w:rPr>
+        <w:t xml:space="preserve">                                                                                             </w:t>
+      </w:r>
+      <w:r>
+        <w:rPr>
+          <w:b/>
+          <w:bCs/>
+          <w:color w:val="000000" w:themeColor="text1"/>
+          <w:lang w:eastAsia="pt-BR"/>
+        </w:rPr>
+        <w:t>Website:</w:t>
+      </w:r>
+      <w:r>
+        <w:rPr>
+          <w:color w:val="000000" w:themeColor="text1"/>
+          <w:lang w:eastAsia="pt-BR"/>
+        </w:rPr>
+        <w:t xml:space="preserve">  </w:t>
+      </w:r>
+      <w:hyperlink r:id="rId7" w:history="1">
+        <w:r>
+          <w:rPr>
+            <w:rStyle w:val="Hyperlink"/>
+            <w:color w:val="000000" w:themeColor="text1"/>
+            <w:lang w:eastAsia="pt-BR"/>
+          </w:rPr>
+          <w:t>https://websitespersonalidos.vercel.app/</w:t>
+        </w:r>
+      </w:hyperlink>
+      <w:r>
+        <w:rPr>
+          <w:color w:val="000000" w:themeColor="text1"/>
+          <w:lang w:eastAsia="pt-BR"/>
+        </w:rPr>
+        <w:t xml:space="preserve">           </w:t>
       </w:r>
     </w:p>
     <w:p>
@@ -207,7 +247,7 @@
     </w:p>
     <w:p>
       <w:pPr>
-        <w:pStyle w:val="NoSpacing"/>
+        <w:pStyle w:val="SemEspaamento"/>
         <w:rPr>
           <w:shd w:val="clear" w:color="auto" w:fill="FFFFFF"/>
         </w:rPr>
@@ -216,7 +256,7 @@
         <w:rPr>
           <w:shd w:val="clear" w:color="auto" w:fill="FFFFFF"/>
         </w:rPr>
-        <w:t>Busco oportunidades onde possa aplicar minha experiência prática e habilidades técnicas em desenvolvimento front-</w:t>
+        <w:t>Buscar oportunidades para aplicar minha experiência prática e habilidades em desenvolvimento front-</w:t>
       </w:r>
       <w:proofErr w:type="spellStart"/>
       <w:r>
@@ -244,12 +284,12 @@
         <w:rPr>
           <w:shd w:val="clear" w:color="auto" w:fill="FFFFFF"/>
         </w:rPr>
-        <w:t xml:space="preserve"> para contribuir significativamente para o sucesso de uma empresa.</w:t>
-      </w:r>
-    </w:p>
-    <w:p>
-      <w:pPr>
-        <w:pStyle w:val="NoSpacing"/>
+        <w:t>, contribuindo para o sucesso e inovação da empresa.</w:t>
+      </w:r>
+    </w:p>
+    <w:p>
+      <w:pPr>
+        <w:pStyle w:val="SemEspaamento"/>
       </w:pPr>
     </w:p>
     <w:p>
@@ -283,7 +323,7 @@
     </w:p>
     <w:p>
       <w:pPr>
-        <w:pStyle w:val="NoSpacing"/>
+        <w:pStyle w:val="SemEspaamento"/>
         <w:numPr>
           <w:ilvl w:val="0"/>
           <w:numId w:val="3"/>
@@ -296,17 +336,69 @@
         <w:rPr>
           <w:lang w:eastAsia="pt-BR"/>
         </w:rPr>
-        <w:t xml:space="preserve">Experiência na criação de sites utilizando Javascript, HTML, CSS, </w:t>
-      </w:r>
-      <w:r>
-        <w:rPr>
-          <w:lang w:eastAsia="pt-BR"/>
-        </w:rPr>
-        <w:t xml:space="preserve">SASS, </w:t>
+        <w:t xml:space="preserve">Experiência na criação de sites utilizando </w:t>
+      </w:r>
+      <w:r>
+        <w:rPr>
+          <w:b/>
+          <w:bCs/>
+          <w:lang w:eastAsia="pt-BR"/>
+        </w:rPr>
+        <w:t>Javascript</w:t>
+      </w:r>
+      <w:r>
+        <w:rPr>
+          <w:lang w:eastAsia="pt-BR"/>
+        </w:rPr>
+        <w:t xml:space="preserve">, </w:t>
+      </w:r>
+      <w:r>
+        <w:rPr>
+          <w:b/>
+          <w:bCs/>
+          <w:lang w:eastAsia="pt-BR"/>
+        </w:rPr>
+        <w:t>HTML</w:t>
+      </w:r>
+      <w:r>
+        <w:rPr>
+          <w:lang w:eastAsia="pt-BR"/>
+        </w:rPr>
+        <w:t xml:space="preserve">, </w:t>
+      </w:r>
+      <w:r>
+        <w:rPr>
+          <w:b/>
+          <w:bCs/>
+          <w:lang w:eastAsia="pt-BR"/>
+        </w:rPr>
+        <w:t>CSS</w:t>
+      </w:r>
+      <w:r>
+        <w:rPr>
+          <w:lang w:eastAsia="pt-BR"/>
+        </w:rPr>
+        <w:t xml:space="preserve">, </w:t>
+      </w:r>
+      <w:r>
+        <w:rPr>
+          <w:b/>
+          <w:bCs/>
+          <w:lang w:eastAsia="pt-BR"/>
+        </w:rPr>
+        <w:t>SASS</w:t>
+      </w:r>
+      <w:r>
+        <w:rPr>
+          <w:lang w:eastAsia="pt-BR"/>
+        </w:rPr>
+        <w:t xml:space="preserve">, </w:t>
       </w:r>
       <w:proofErr w:type="spellStart"/>
       <w:r>
         <w:rPr>
+          <w:b/>
+          <w:bCs/>
           <w:lang w:eastAsia="pt-BR"/>
         </w:rPr>
         <w:t>Bootstrap</w:t>
@@ -320,19 +412,43 @@
       </w:r>
       <w:r>
         <w:rPr>
-          <w:lang w:eastAsia="pt-BR"/>
-        </w:rPr>
-        <w:t xml:space="preserve">Python com os </w:t>
-      </w:r>
-      <w:r>
-        <w:rPr>
-          <w:lang w:eastAsia="pt-BR"/>
-        </w:rPr>
-        <w:t xml:space="preserve">frameworks Django e </w:t>
+          <w:b/>
+          <w:bCs/>
+          <w:lang w:eastAsia="pt-BR"/>
+        </w:rPr>
+        <w:t>Python</w:t>
+      </w:r>
+      <w:r>
+        <w:rPr>
+          <w:lang w:eastAsia="pt-BR"/>
+        </w:rPr>
+        <w:t xml:space="preserve"> com os </w:t>
+      </w:r>
+      <w:r>
+        <w:rPr>
+          <w:lang w:eastAsia="pt-BR"/>
+        </w:rPr>
+        <w:t xml:space="preserve">frameworks </w:t>
+      </w:r>
+      <w:r>
+        <w:rPr>
+          <w:b/>
+          <w:bCs/>
+          <w:lang w:eastAsia="pt-BR"/>
+        </w:rPr>
+        <w:t>Django</w:t>
+      </w:r>
+      <w:r>
+        <w:rPr>
+          <w:lang w:eastAsia="pt-BR"/>
+        </w:rPr>
+        <w:t xml:space="preserve"> e </w:t>
       </w:r>
       <w:proofErr w:type="spellStart"/>
       <w:r>
         <w:rPr>
+          <w:b/>
+          <w:bCs/>
           <w:lang w:eastAsia="pt-BR"/>
         </w:rPr>
         <w:t>Flask</w:t>
@@ -347,7 +463,7 @@
     </w:p>
     <w:p>
       <w:pPr>
-        <w:pStyle w:val="NoSpacing"/>
+        <w:pStyle w:val="SemEspaamento"/>
         <w:numPr>
           <w:ilvl w:val="0"/>
           <w:numId w:val="3"/>
@@ -366,30 +482,122 @@
         <w:rPr>
           <w:lang w:eastAsia="pt-BR"/>
         </w:rPr>
-        <w:t xml:space="preserve"> em desenvolvimento de sistemas utilizando Python, MySQL e integração de APIs.                                                                                        </w:t>
-      </w:r>
-    </w:p>
-    <w:p>
-      <w:pPr>
-        <w:pStyle w:val="NoSpacing"/>
+        <w:t xml:space="preserve"> em desenvolvimento de sistemas utilizando </w:t>
+      </w:r>
+      <w:r>
+        <w:rPr>
+          <w:b/>
+          <w:bCs/>
+          <w:lang w:eastAsia="pt-BR"/>
+        </w:rPr>
+        <w:t>Python</w:t>
+      </w:r>
+      <w:r>
+        <w:rPr>
+          <w:lang w:eastAsia="pt-BR"/>
+        </w:rPr>
+        <w:t xml:space="preserve">, </w:t>
+      </w:r>
+      <w:r>
+        <w:rPr>
+          <w:b/>
+          <w:bCs/>
+          <w:lang w:eastAsia="pt-BR"/>
+        </w:rPr>
+        <w:t>MySQL</w:t>
+      </w:r>
+      <w:r>
+        <w:rPr>
+          <w:lang w:eastAsia="pt-BR"/>
+        </w:rPr>
+        <w:t xml:space="preserve"> e integração de </w:t>
+      </w:r>
+      <w:r>
+        <w:rPr>
+          <w:b/>
+          <w:bCs/>
+          <w:lang w:eastAsia="pt-BR"/>
+        </w:rPr>
+        <w:t>APIs</w:t>
+      </w:r>
+      <w:r>
+        <w:rPr>
+          <w:lang w:eastAsia="pt-BR"/>
+        </w:rPr>
+        <w:t xml:space="preserve">.                                                                                        </w:t>
+      </w:r>
+    </w:p>
+    <w:p>
+      <w:pPr>
+        <w:pStyle w:val="SemEspaamento"/>
         <w:numPr>
           <w:ilvl w:val="0"/>
-          <w:numId w:val="4"/>
+          <w:numId w:val="3"/>
         </w:numPr>
         <w:rPr>
-          <w:lang w:eastAsia="pt-BR"/>
-        </w:rPr>
-      </w:pPr>
-      <w:r>
-        <w:rPr>
-          <w:lang w:eastAsia="pt-BR"/>
-        </w:rPr>
-        <w:t xml:space="preserve">Conhecimentos em metodologias ágeis e práticas de desenvolvimento de software.                                                                                                                     </w:t>
-      </w:r>
-    </w:p>
-    <w:p>
-      <w:pPr>
-        <w:pStyle w:val="NoSpacing"/>
+          <w:rFonts w:cstheme="minorHAnsi"/>
+          <w:lang w:eastAsia="pt-BR"/>
+        </w:rPr>
+      </w:pPr>
+      <w:r>
+        <w:rPr>
+          <w:rFonts w:cstheme="minorHAnsi"/>
+          <w:lang w:eastAsia="pt-BR"/>
+        </w:rPr>
+        <w:t>Conhecimento básic</w:t>
+      </w:r>
+      <w:r>
+        <w:rPr>
+          <w:rFonts w:cstheme="minorHAnsi"/>
+          <w:lang w:eastAsia="pt-BR"/>
+        </w:rPr>
+        <w:t xml:space="preserve">o </w:t>
+      </w:r>
+      <w:r>
+        <w:rPr>
+          <w:rFonts w:cstheme="minorHAnsi"/>
+          <w:lang w:eastAsia="pt-BR"/>
+        </w:rPr>
+        <w:t xml:space="preserve">em </w:t>
+      </w:r>
+      <w:proofErr w:type="spellStart"/>
+      <w:r>
+        <w:rPr>
+          <w:rFonts w:cstheme="minorHAnsi"/>
+          <w:b/>
+          <w:bCs/>
+          <w:lang w:eastAsia="pt-BR"/>
+        </w:rPr>
+        <w:t>React</w:t>
+      </w:r>
+      <w:proofErr w:type="spellEnd"/>
+      <w:r>
+        <w:rPr>
+          <w:rFonts w:cstheme="minorHAnsi"/>
+          <w:lang w:eastAsia="pt-BR"/>
+        </w:rPr>
+        <w:t xml:space="preserve"> e </w:t>
+      </w:r>
+      <w:r>
+        <w:rPr>
+          <w:rFonts w:cstheme="minorHAnsi"/>
+          <w:b/>
+          <w:bCs/>
+          <w:lang w:eastAsia="pt-BR"/>
+        </w:rPr>
+        <w:t>Node JS</w:t>
+      </w:r>
+      <w:r>
+        <w:rPr>
+          <w:rFonts w:cstheme="minorHAnsi"/>
+          <w:lang w:eastAsia="pt-BR"/>
+        </w:rPr>
+        <w:t>.</w:t>
+      </w:r>
+    </w:p>
+    <w:p>
+      <w:pPr>
+        <w:pStyle w:val="SemEspaamento"/>
         <w:numPr>
           <w:ilvl w:val="0"/>
           <w:numId w:val="5"/>
@@ -427,7 +635,7 @@
     </w:p>
     <w:p>
       <w:pPr>
-        <w:pStyle w:val="NoSpacing"/>
+        <w:pStyle w:val="SemEspaamento"/>
         <w:numPr>
           <w:ilvl w:val="0"/>
           <w:numId w:val="6"/>
@@ -445,7 +653,7 @@
     </w:p>
     <w:p>
       <w:pPr>
-        <w:pStyle w:val="NoSpacing"/>
+        <w:pStyle w:val="SemEspaamento"/>
         <w:numPr>
           <w:ilvl w:val="0"/>
           <w:numId w:val="6"/>
@@ -481,6 +689,8 @@
       <w:proofErr w:type="spellStart"/>
       <w:r>
         <w:rPr>
+          <w:b/>
+          <w:bCs/>
           <w:lang w:eastAsia="pt-BR"/>
         </w:rPr>
         <w:t>React</w:t>
@@ -490,12 +700,26 @@
         <w:rPr>
           <w:lang w:eastAsia="pt-BR"/>
         </w:rPr>
-        <w:t xml:space="preserve"> e Node JS.</w:t>
-      </w:r>
-    </w:p>
-    <w:p>
-      <w:pPr>
-        <w:pStyle w:val="NoSpacing"/>
+        <w:t xml:space="preserve"> e </w:t>
+      </w:r>
+      <w:r>
+        <w:rPr>
+          <w:b/>
+          <w:bCs/>
+          <w:lang w:eastAsia="pt-BR"/>
+        </w:rPr>
+        <w:t>Node JS</w:t>
+      </w:r>
+      <w:r>
+        <w:rPr>
+          <w:lang w:eastAsia="pt-BR"/>
+        </w:rPr>
+        <w:t>.</w:t>
+      </w:r>
+    </w:p>
+    <w:p>
+      <w:pPr>
+        <w:pStyle w:val="SemEspaamento"/>
         <w:numPr>
           <w:ilvl w:val="0"/>
           <w:numId w:val="6"/>
@@ -513,6 +737,8 @@
       <w:proofErr w:type="spellStart"/>
       <w:r>
         <w:rPr>
+          <w:b/>
+          <w:bCs/>
           <w:lang w:eastAsia="pt-BR"/>
         </w:rPr>
         <w:t>Git</w:t>
@@ -527,6 +753,8 @@
       <w:proofErr w:type="spellStart"/>
       <w:r>
         <w:rPr>
+          <w:b/>
+          <w:bCs/>
           <w:lang w:eastAsia="pt-BR"/>
         </w:rPr>
         <w:t>Github</w:t>
@@ -541,7 +769,7 @@
     </w:p>
     <w:p>
       <w:pPr>
-        <w:pStyle w:val="NoSpacing"/>
+        <w:pStyle w:val="SemEspaamento"/>
         <w:ind w:left="720"/>
         <w:rPr>
           <w:lang w:eastAsia="pt-BR"/>
@@ -579,7 +807,7 @@
     </w:p>
     <w:p>
       <w:pPr>
-        <w:pStyle w:val="NoSpacing"/>
+        <w:pStyle w:val="SemEspaamento"/>
         <w:rPr>
           <w:lang w:eastAsia="pt-BR"/>
         </w:rPr>
@@ -597,7 +825,19 @@
           <w:lang w:eastAsia="pt-BR"/>
         </w:rPr>
         <w:br/>
-        <w:t>Instituição de Ensino: Impacta</w:t>
+        <w:t xml:space="preserve">Instituição de Ensino: </w:t>
+      </w:r>
+      <w:r>
+        <w:rPr>
+          <w:lang w:eastAsia="pt-BR"/>
+        </w:rPr>
+        <w:t xml:space="preserve">Faculdade </w:t>
+      </w:r>
+      <w:r>
+        <w:rPr>
+          <w:lang w:eastAsia="pt-BR"/>
+        </w:rPr>
+        <w:t>Impacta</w:t>
       </w:r>
       <w:r>
         <w:rPr>
@@ -609,7 +849,7 @@
     </w:p>
     <w:p>
       <w:pPr>
-        <w:pStyle w:val="NoSpacing"/>
+        <w:pStyle w:val="SemEspaamento"/>
         <w:rPr>
           <w:lang w:eastAsia="pt-BR"/>
         </w:rPr>
@@ -646,7 +886,7 @@
     </w:p>
     <w:p>
       <w:pPr>
-        <w:pStyle w:val="NoSpacing"/>
+        <w:pStyle w:val="SemEspaamento"/>
         <w:numPr>
           <w:ilvl w:val="0"/>
           <w:numId w:val="12"/>
@@ -728,7 +968,7 @@
     </w:p>
     <w:p>
       <w:pPr>
-        <w:pStyle w:val="NoSpacing"/>
+        <w:pStyle w:val="SemEspaamento"/>
         <w:ind w:left="720"/>
         <w:rPr>
           <w:lang w:eastAsia="pt-BR"/>
@@ -769,7 +1009,7 @@
     </w:p>
     <w:p>
       <w:pPr>
-        <w:pStyle w:val="NoSpacing"/>
+        <w:pStyle w:val="SemEspaamento"/>
         <w:numPr>
           <w:ilvl w:val="0"/>
           <w:numId w:val="10"/>
@@ -839,7 +1079,7 @@
     </w:p>
     <w:p>
       <w:pPr>
-        <w:pStyle w:val="NoSpacing"/>
+        <w:pStyle w:val="SemEspaamento"/>
         <w:ind w:left="720"/>
         <w:rPr>
           <w:lang w:eastAsia="pt-BR"/>
@@ -872,7 +1112,7 @@
     </w:p>
     <w:p>
       <w:pPr>
-        <w:pStyle w:val="NoSpacing"/>
+        <w:pStyle w:val="SemEspaamento"/>
         <w:numPr>
           <w:ilvl w:val="0"/>
           <w:numId w:val="10"/>
@@ -968,7 +1208,7 @@
     </w:p>
     <w:p>
       <w:pPr>
-        <w:pStyle w:val="NoSpacing"/>
+        <w:pStyle w:val="SemEspaamento"/>
         <w:ind w:left="708"/>
         <w:rPr>
           <w:lang w:eastAsia="pt-BR"/>
@@ -989,7 +1229,162 @@
     </w:p>
     <w:p>
       <w:pPr>
-        <w:pStyle w:val="NoSpacing"/>
+        <w:pStyle w:val="SemEspaamento"/>
+        <w:ind w:left="708"/>
+        <w:rPr>
+          <w:b/>
+          <w:bCs/>
+          <w:lang w:eastAsia="pt-BR"/>
+        </w:rPr>
+      </w:pPr>
+    </w:p>
+    <w:p>
+      <w:pPr>
+        <w:pStyle w:val="SemEspaamento"/>
+        <w:ind w:left="708"/>
+        <w:rPr>
+          <w:b/>
+          <w:bCs/>
+          <w:lang w:eastAsia="pt-BR"/>
+        </w:rPr>
+      </w:pPr>
+    </w:p>
+    <w:p>
+      <w:pPr>
+        <w:pStyle w:val="SemEspaamento"/>
+        <w:ind w:left="708"/>
+        <w:rPr>
+          <w:lang w:eastAsia="pt-BR"/>
+        </w:rPr>
+      </w:pPr>
+      <w:r>
+        <w:rPr>
+          <w:lang w:eastAsia="pt-BR"/>
+        </w:rPr>
+        <w:lastRenderedPageBreak/>
+        <w:t xml:space="preserve">                                                                                                                 </w:t>
+      </w:r>
+      <w:r>
+        <w:rPr>
+          <w:lang w:eastAsia="pt-BR"/>
+        </w:rPr>
+        <w:t xml:space="preserve">                                          </w:t>
+      </w:r>
+      <w:r>
+        <w:rPr>
+          <w:lang w:eastAsia="pt-BR"/>
+        </w:rPr>
+        <w:t xml:space="preserve">                                </w:t>
+      </w:r>
+    </w:p>
+    <w:p>
+      <w:pPr>
+        <w:pStyle w:val="SemEspaamento"/>
+        <w:rPr>
+          <w:b/>
+          <w:bCs/>
+          <w:sz w:val="26"/>
+          <w:szCs w:val="26"/>
+        </w:rPr>
+      </w:pPr>
+      <w:r>
+        <w:rPr>
+          <w:b/>
+          <w:bCs/>
+          <w:sz w:val="26"/>
+          <w:szCs w:val="26"/>
+        </w:rPr>
+        <w:t>EXPERIÊNCIA PROFISSIONAL:</w:t>
+      </w:r>
+    </w:p>
+    <w:p>
+      <w:pPr>
+        <w:pStyle w:val="SemEspaamento"/>
+        <w:rPr>
+          <w:b/>
+          <w:bCs/>
+          <w:sz w:val="26"/>
+          <w:szCs w:val="26"/>
+        </w:rPr>
+      </w:pPr>
+    </w:p>
+    <w:p>
+      <w:pPr>
+        <w:pStyle w:val="SemEspaamento"/>
+        <w:rPr>
+          <w:lang w:eastAsia="pt-BR"/>
+        </w:rPr>
+      </w:pPr>
+      <w:r>
+        <w:rPr>
+          <w:b/>
+          <w:bCs/>
+        </w:rPr>
+        <w:t>Empresa</w:t>
+      </w:r>
+      <w:r>
+        <w:t xml:space="preserve">: </w:t>
+      </w:r>
+      <w:r>
+        <w:rPr>
+          <w:b/>
+          <w:bCs/>
+        </w:rPr>
+        <w:t xml:space="preserve">Capital </w:t>
+      </w:r>
+      <w:proofErr w:type="spellStart"/>
+      <w:r>
+        <w:rPr>
+          <w:b/>
+          <w:bCs/>
+        </w:rPr>
+        <w:t>Finance</w:t>
+      </w:r>
+      <w:proofErr w:type="spellEnd"/>
+      <w:r>
+        <w:rPr>
+          <w:b/>
+          <w:bCs/>
+        </w:rPr>
+        <w:t xml:space="preserve"> LTDA</w:t>
+      </w:r>
+      <w:r>
+        <w:t>.</w:t>
+      </w:r>
+      <w:r>
+        <w:br/>
+      </w:r>
+      <w:r>
+        <w:rPr>
+          <w:lang w:eastAsia="pt-BR"/>
+        </w:rPr>
+        <w:t>Cargo: Assistente Pleno de Desenvolvimento de Sistemas</w:t>
+      </w:r>
+      <w:r>
+        <w:rPr>
+          <w:lang w:eastAsia="pt-BR"/>
+        </w:rPr>
+        <w:br/>
+        <w:t xml:space="preserve">Período: 02/2023 </w:t>
+      </w:r>
+      <w:r>
+        <w:rPr>
+          <w:lang w:eastAsia="pt-BR"/>
+        </w:rPr>
+        <w:t>– 05/2024</w:t>
+      </w:r>
+    </w:p>
+    <w:p>
+      <w:pPr>
+        <w:pStyle w:val="SemEspaamento"/>
+        <w:rPr>
+          <w:lang w:eastAsia="pt-BR"/>
+        </w:rPr>
+      </w:pPr>
+    </w:p>
+    <w:p>
+      <w:pPr>
+        <w:pStyle w:val="SemEspaamento"/>
         <w:numPr>
           <w:ilvl w:val="0"/>
           <w:numId w:val="10"/>
@@ -1000,168 +1395,70 @@
       </w:pPr>
       <w:r>
         <w:rPr>
-          <w:b/>
-          <w:bCs/>
-          <w:lang w:eastAsia="pt-BR"/>
-        </w:rPr>
-        <w:t xml:space="preserve">Google </w:t>
+          <w:lang w:eastAsia="pt-BR"/>
+        </w:rPr>
+        <w:t>Desenvolvi e implementei soluções front-</w:t>
       </w:r>
       <w:proofErr w:type="spellStart"/>
       <w:r>
         <w:rPr>
-          <w:b/>
-          <w:bCs/>
-          <w:lang w:eastAsia="pt-BR"/>
-        </w:rPr>
-        <w:t>Analytics</w:t>
+          <w:lang w:eastAsia="pt-BR"/>
+        </w:rPr>
+        <w:t>end</w:t>
       </w:r>
       <w:proofErr w:type="spellEnd"/>
       <w:r>
         <w:rPr>
           <w:lang w:eastAsia="pt-BR"/>
         </w:rPr>
-        <w:t xml:space="preserve"> | Em andamento</w:t>
-      </w:r>
-    </w:p>
-    <w:p>
-      <w:pPr>
-        <w:pStyle w:val="NoSpacing"/>
-        <w:ind w:left="720"/>
-        <w:rPr>
-          <w:lang w:eastAsia="pt-BR"/>
-        </w:rPr>
-      </w:pPr>
-    </w:p>
-    <w:p>
-      <w:pPr>
-        <w:pStyle w:val="NoSpacing"/>
-        <w:ind w:left="708"/>
-        <w:rPr>
-          <w:lang w:eastAsia="pt-BR"/>
-        </w:rPr>
-      </w:pPr>
-      <w:r>
-        <w:rPr>
-          <w:lang w:eastAsia="pt-BR"/>
-        </w:rPr>
-        <w:t xml:space="preserve">                                                                                                                 </w:t>
-      </w:r>
-      <w:r>
-        <w:rPr>
-          <w:lang w:eastAsia="pt-BR"/>
-        </w:rPr>
-        <w:t xml:space="preserve">                                          </w:t>
-      </w:r>
-      <w:r>
-        <w:rPr>
-          <w:lang w:eastAsia="pt-BR"/>
-        </w:rPr>
-        <w:t xml:space="preserve">                                </w:t>
-      </w:r>
-    </w:p>
-    <w:p>
-      <w:pPr>
-        <w:pStyle w:val="NoSpacing"/>
-        <w:rPr>
-          <w:b/>
-          <w:bCs/>
-          <w:sz w:val="26"/>
-          <w:szCs w:val="26"/>
-        </w:rPr>
-      </w:pPr>
-      <w:r>
-        <w:rPr>
-          <w:b/>
-          <w:bCs/>
-          <w:sz w:val="26"/>
-          <w:szCs w:val="26"/>
-        </w:rPr>
-        <w:lastRenderedPageBreak/>
-        <w:t>EXPERIÊNCIA PROFISSIONAL:</w:t>
-      </w:r>
-    </w:p>
-    <w:p>
-      <w:pPr>
-        <w:pStyle w:val="NoSpacing"/>
-        <w:rPr>
-          <w:b/>
-          <w:bCs/>
-          <w:sz w:val="26"/>
-          <w:szCs w:val="26"/>
-        </w:rPr>
-      </w:pPr>
-    </w:p>
-    <w:p>
-      <w:pPr>
-        <w:pStyle w:val="NoSpacing"/>
-        <w:rPr>
-          <w:lang w:eastAsia="pt-BR"/>
-        </w:rPr>
-      </w:pPr>
-      <w:r>
-        <w:rPr>
-          <w:b/>
-          <w:bCs/>
-        </w:rPr>
-        <w:t>Empresa</w:t>
-      </w:r>
-      <w:r>
-        <w:t xml:space="preserve">: </w:t>
-      </w:r>
-      <w:r>
-        <w:rPr>
-          <w:b/>
-          <w:bCs/>
-        </w:rPr>
-        <w:t xml:space="preserve">Capital </w:t>
+        <w:t xml:space="preserve"> e </w:t>
       </w:r>
       <w:proofErr w:type="spellStart"/>
       <w:r>
         <w:rPr>
-          <w:b/>
-          <w:bCs/>
-        </w:rPr>
-        <w:t>Finance</w:t>
+          <w:lang w:eastAsia="pt-BR"/>
+        </w:rPr>
+        <w:t>back-end</w:t>
       </w:r>
       <w:proofErr w:type="spellEnd"/>
       <w:r>
         <w:rPr>
-          <w:b/>
-          <w:bCs/>
-        </w:rPr>
-        <w:t xml:space="preserve"> LTDA</w:t>
-      </w:r>
-      <w:r>
-        <w:t>.</w:t>
-      </w:r>
-      <w:r>
-        <w:br/>
-      </w:r>
-      <w:r>
-        <w:rPr>
-          <w:lang w:eastAsia="pt-BR"/>
-        </w:rPr>
-        <w:t>Cargo: Assistente Pleno de Desenvolvimento de Sistemas</w:t>
-      </w:r>
-      <w:r>
-        <w:rPr>
-          <w:lang w:eastAsia="pt-BR"/>
-        </w:rPr>
-        <w:br/>
-        <w:t xml:space="preserve">Período: 02/2023 </w:t>
-      </w:r>
-    </w:p>
-    <w:p>
-      <w:pPr>
-        <w:pStyle w:val="NoSpacing"/>
-        <w:rPr>
-          <w:lang w:eastAsia="pt-BR"/>
-        </w:rPr>
-      </w:pPr>
-    </w:p>
-    <w:p>
-      <w:pPr>
-        <w:pStyle w:val="NoSpacing"/>
+          <w:lang w:eastAsia="pt-BR"/>
+        </w:rPr>
+        <w:t xml:space="preserve"> utilizando </w:t>
+      </w:r>
+      <w:proofErr w:type="spellStart"/>
+      <w:r>
+        <w:rPr>
+          <w:lang w:eastAsia="pt-BR"/>
+        </w:rPr>
+        <w:t>JavaScript</w:t>
+      </w:r>
+      <w:proofErr w:type="spellEnd"/>
+      <w:r>
+        <w:rPr>
+          <w:lang w:eastAsia="pt-BR"/>
+        </w:rPr>
+        <w:t xml:space="preserve">, HTML, CSS, Python, Django e </w:t>
+      </w:r>
+      <w:proofErr w:type="spellStart"/>
+      <w:r>
+        <w:rPr>
+          <w:lang w:eastAsia="pt-BR"/>
+        </w:rPr>
+        <w:t>Flask</w:t>
+      </w:r>
+      <w:proofErr w:type="spellEnd"/>
+      <w:r>
+        <w:rPr>
+          <w:lang w:eastAsia="pt-BR"/>
+        </w:rPr>
+        <w:t>, melhorando a performance e a funcionalidade dos sites.</w:t>
+      </w:r>
+    </w:p>
+    <w:p>
+      <w:pPr>
+        <w:pStyle w:val="SemEspaamento"/>
         <w:numPr>
           <w:ilvl w:val="0"/>
           <w:numId w:val="10"/>
@@ -1174,112 +1471,21 @@
         <w:rPr>
           <w:lang w:eastAsia="pt-BR"/>
         </w:rPr>
-        <w:t>Desenvolvimento front-</w:t>
-      </w:r>
-      <w:proofErr w:type="spellStart"/>
-      <w:r>
-        <w:rPr>
-          <w:lang w:eastAsia="pt-BR"/>
-        </w:rPr>
-        <w:t>end</w:t>
-      </w:r>
-      <w:proofErr w:type="spellEnd"/>
-      <w:r>
-        <w:rPr>
-          <w:lang w:eastAsia="pt-BR"/>
-        </w:rPr>
-        <w:t xml:space="preserve"> e </w:t>
-      </w:r>
-      <w:proofErr w:type="spellStart"/>
-      <w:r>
-        <w:rPr>
-          <w:lang w:eastAsia="pt-BR"/>
-        </w:rPr>
-        <w:t>back-end</w:t>
-      </w:r>
-      <w:proofErr w:type="spellEnd"/>
-      <w:r>
-        <w:rPr>
-          <w:lang w:eastAsia="pt-BR"/>
-        </w:rPr>
-        <w:t xml:space="preserve"> de sites, utilizando </w:t>
-      </w:r>
-      <w:proofErr w:type="spellStart"/>
-      <w:r>
-        <w:rPr>
-          <w:lang w:eastAsia="pt-BR"/>
-        </w:rPr>
-        <w:t>JavaScript</w:t>
-      </w:r>
-      <w:proofErr w:type="spellEnd"/>
-      <w:r>
-        <w:rPr>
-          <w:lang w:eastAsia="pt-BR"/>
-        </w:rPr>
-        <w:t>, HTML, CSS,</w:t>
-      </w:r>
-      <w:r>
-        <w:rPr>
-          <w:lang w:eastAsia="pt-BR"/>
-        </w:rPr>
-        <w:t xml:space="preserve"> Python</w:t>
-      </w:r>
-      <w:r>
-        <w:rPr>
-          <w:lang w:eastAsia="pt-BR"/>
-        </w:rPr>
-        <w:t xml:space="preserve"> e frameworks Django e </w:t>
-      </w:r>
-      <w:proofErr w:type="spellStart"/>
-      <w:r>
-        <w:rPr>
-          <w:lang w:eastAsia="pt-BR"/>
-        </w:rPr>
-        <w:t>Flask</w:t>
-      </w:r>
-      <w:proofErr w:type="spellEnd"/>
-      <w:r>
-        <w:rPr>
-          <w:lang w:eastAsia="pt-BR"/>
-        </w:rPr>
-        <w:t>.</w:t>
-      </w:r>
-      <w:r>
-        <w:rPr>
-          <w:lang w:eastAsia="pt-BR"/>
-        </w:rPr>
-        <w:t xml:space="preserve">                                                                                                       </w:t>
-      </w:r>
-    </w:p>
-    <w:p>
-      <w:pPr>
-        <w:pStyle w:val="NoSpacing"/>
-        <w:numPr>
-          <w:ilvl w:val="0"/>
-          <w:numId w:val="10"/>
-        </w:numPr>
-        <w:rPr>
-          <w:lang w:eastAsia="pt-BR"/>
-        </w:rPr>
-      </w:pPr>
-      <w:r>
-        <w:rPr>
-          <w:lang w:eastAsia="pt-BR"/>
-        </w:rPr>
-        <w:t>Colaboração em equipe para implementação de soluções inovadoras e eficientes.</w:t>
-      </w:r>
-    </w:p>
-    <w:p>
-      <w:pPr>
-        <w:pStyle w:val="NoSpacing"/>
-        <w:rPr>
-          <w:lang w:eastAsia="pt-BR"/>
-        </w:rPr>
-      </w:pPr>
-    </w:p>
-    <w:p>
-      <w:pPr>
-        <w:pStyle w:val="NoSpacing"/>
+        <w:t>Colaborei com a equipe para implementar soluções inovadoras e eficientes, contribuindo para o sucesso dos projetos.</w:t>
+      </w:r>
+    </w:p>
+    <w:p>
+      <w:pPr>
+        <w:pStyle w:val="SemEspaamento"/>
+        <w:ind w:left="720"/>
+        <w:rPr>
+          <w:lang w:eastAsia="pt-BR"/>
+        </w:rPr>
+      </w:pPr>
+    </w:p>
+    <w:p>
+      <w:pPr>
+        <w:pStyle w:val="SemEspaamento"/>
         <w:rPr>
           <w:lang w:eastAsia="pt-BR"/>
         </w:rPr>
@@ -1318,15 +1524,16 @@
     </w:p>
     <w:p>
       <w:pPr>
-        <w:pStyle w:val="NoSpacing"/>
-        <w:rPr>
-          <w:lang w:eastAsia="pt-BR"/>
-        </w:rPr>
-      </w:pPr>
-    </w:p>
-    <w:p>
-      <w:pPr>
-        <w:pStyle w:val="NoSpacing"/>
+        <w:pStyle w:val="SemEspaamento"/>
+        <w:rPr>
+          <w:u w:val="single"/>
+          <w:lang w:eastAsia="pt-BR"/>
+        </w:rPr>
+      </w:pPr>
+    </w:p>
+    <w:p>
+      <w:pPr>
+        <w:pStyle w:val="SemEspaamento"/>
         <w:numPr>
           <w:ilvl w:val="0"/>
           <w:numId w:val="13"/>
@@ -1339,7 +1546,13 @@
         <w:rPr>
           <w:lang w:eastAsia="pt-BR"/>
         </w:rPr>
-        <w:t>Responsável pela organização e separação de produtos.</w:t>
+        <w:t>Organizei e separei produtos para o e-commerce, melhorando a eficiência logística</w:t>
+      </w:r>
+      <w:r>
+        <w:rPr>
+          <w:lang w:eastAsia="pt-BR"/>
+        </w:rPr>
+        <w:t>.</w:t>
       </w:r>
       <w:r>
         <w:rPr>
@@ -1350,7 +1563,7 @@
     </w:p>
     <w:p>
       <w:pPr>
-        <w:pStyle w:val="NoSpacing"/>
+        <w:pStyle w:val="SemEspaamento"/>
         <w:numPr>
           <w:ilvl w:val="0"/>
           <w:numId w:val="13"/>
@@ -1363,12 +1576,13 @@
         <w:rPr>
           <w:lang w:eastAsia="pt-BR"/>
         </w:rPr>
-        <w:t>Atendimento e resolução de questões de clientes via WhatsApp e e-mail.</w:t>
-      </w:r>
-    </w:p>
-    <w:p>
-      <w:pPr>
-        <w:pStyle w:val="NoSpacing"/>
+        <w:t>Atendi e resolvi questões de clientes via WhatsApp e e-mail, proporcionando uma experiência de cliente aprimorada.</w:t>
+      </w:r>
+    </w:p>
+    <w:p>
+      <w:pPr>
+        <w:pStyle w:val="SemEspaamento"/>
+        <w:ind w:left="720"/>
         <w:rPr>
           <w:lang w:eastAsia="pt-BR"/>
         </w:rPr>
@@ -1398,15 +1612,15 @@
     </w:p>
     <w:p>
       <w:pPr>
-        <w:pStyle w:val="NoSpacing"/>
-        <w:rPr>
-          <w:lang w:eastAsia="pt-BR"/>
-        </w:rPr>
-      </w:pPr>
-    </w:p>
-    <w:p>
-      <w:pPr>
-        <w:pStyle w:val="NoSpacing"/>
+        <w:pStyle w:val="SemEspaamento"/>
+        <w:rPr>
+          <w:lang w:eastAsia="pt-BR"/>
+        </w:rPr>
+      </w:pPr>
+    </w:p>
+    <w:p>
+      <w:pPr>
+        <w:pStyle w:val="SemEspaamento"/>
         <w:rPr>
           <w:lang w:eastAsia="pt-BR"/>
         </w:rPr>
@@ -1444,15 +1658,15 @@
     </w:p>
     <w:p>
       <w:pPr>
-        <w:pStyle w:val="NoSpacing"/>
-        <w:rPr>
-          <w:lang w:eastAsia="pt-BR"/>
-        </w:rPr>
-      </w:pPr>
-    </w:p>
-    <w:p>
-      <w:pPr>
-        <w:pStyle w:val="NoSpacing"/>
+        <w:pStyle w:val="SemEspaamento"/>
+        <w:rPr>
+          <w:lang w:eastAsia="pt-BR"/>
+        </w:rPr>
+      </w:pPr>
+    </w:p>
+    <w:p>
+      <w:pPr>
+        <w:pStyle w:val="SemEspaamento"/>
         <w:rPr>
           <w:lang w:eastAsia="pt-BR"/>
         </w:rPr>
@@ -1466,15 +1680,15 @@
     </w:p>
     <w:p>
       <w:pPr>
-        <w:pStyle w:val="NoSpacing"/>
-        <w:rPr>
-          <w:lang w:eastAsia="pt-BR"/>
-        </w:rPr>
-      </w:pPr>
-    </w:p>
-    <w:p>
-      <w:pPr>
-        <w:pStyle w:val="NoSpacing"/>
+        <w:pStyle w:val="SemEspaamento"/>
+        <w:rPr>
+          <w:lang w:eastAsia="pt-BR"/>
+        </w:rPr>
+      </w:pPr>
+    </w:p>
+    <w:p>
+      <w:pPr>
+        <w:pStyle w:val="SemEspaamento"/>
         <w:rPr>
           <w:lang w:eastAsia="pt-BR"/>
         </w:rPr>
@@ -1518,7 +1732,7 @@
     </w:p>
     <w:p>
       <w:pPr>
-        <w:pStyle w:val="NoSpacing"/>
+        <w:pStyle w:val="SemEspaamento"/>
       </w:pPr>
     </w:p>
     <w:p>
@@ -1762,6 +1976,119 @@
     </w:lvl>
   </w:abstractNum>
   <w:abstractNum w:abstractNumId="2" w15:restartNumberingAfterBreak="0">
+    <w:nsid w:val="0517649E"/>
+    <w:multiLevelType w:val="hybridMultilevel"/>
+    <w:tmpl w:val="B7863D36"/>
+    <w:lvl w:ilvl="0" w:tplc="29027BBA">
+      <w:start w:val="1"/>
+      <w:numFmt w:val="bullet"/>
+      <w:lvlText w:val=""/>
+      <w:lvlJc w:val="left"/>
+      <w:pPr>
+        <w:ind w:left="1800" w:hanging="360"/>
+      </w:pPr>
+      <w:rPr>
+        <w:rFonts w:ascii="Wingdings" w:hAnsi="Wingdings" w:hint="default"/>
+      </w:rPr>
+    </w:lvl>
+    <w:lvl w:ilvl="1" w:tplc="04160003" w:tentative="1">
+      <w:start w:val="1"/>
+      <w:numFmt w:val="bullet"/>
+      <w:lvlText w:val="o"/>
+      <w:lvlJc w:val="left"/>
+      <w:pPr>
+        <w:ind w:left="2520" w:hanging="360"/>
+      </w:pPr>
+      <w:rPr>
+        <w:rFonts w:ascii="Courier New" w:hAnsi="Courier New" w:cs="Courier New" w:hint="default"/>
+      </w:rPr>
+    </w:lvl>
+    <w:lvl w:ilvl="2" w:tplc="04160005" w:tentative="1">
+      <w:start w:val="1"/>
+      <w:numFmt w:val="bullet"/>
+      <w:lvlText w:val=""/>
+      <w:lvlJc w:val="left"/>
+      <w:pPr>
+        <w:ind w:left="3240" w:hanging="360"/>
+      </w:pPr>
+      <w:rPr>
+        <w:rFonts w:ascii="Wingdings" w:hAnsi="Wingdings" w:hint="default"/>
+      </w:rPr>
+    </w:lvl>
+    <w:lvl w:ilvl="3" w:tplc="04160001" w:tentative="1">
+      <w:start w:val="1"/>
+      <w:numFmt w:val="bullet"/>
+      <w:lvlText w:val=""/>
+      <w:lvlJc w:val="left"/>
+      <w:pPr>
+        <w:ind w:left="3960" w:hanging="360"/>
+      </w:pPr>
+      <w:rPr>
+        <w:rFonts w:ascii="Symbol" w:hAnsi="Symbol" w:hint="default"/>
+      </w:rPr>
+    </w:lvl>
+    <w:lvl w:ilvl="4" w:tplc="04160003" w:tentative="1">
+      <w:start w:val="1"/>
+      <w:numFmt w:val="bullet"/>
+      <w:lvlText w:val="o"/>
+      <w:lvlJc w:val="left"/>
+      <w:pPr>
+        <w:ind w:left="4680" w:hanging="360"/>
+      </w:pPr>
+      <w:rPr>
+        <w:rFonts w:ascii="Courier New" w:hAnsi="Courier New" w:cs="Courier New" w:hint="default"/>
+      </w:rPr>
+    </w:lvl>
+    <w:lvl w:ilvl="5" w:tplc="04160005" w:tentative="1">
+      <w:start w:val="1"/>
+      <w:numFmt w:val="bullet"/>
+      <w:lvlText w:val=""/>
+      <w:lvlJc w:val="left"/>
+      <w:pPr>
+        <w:ind w:left="5400" w:hanging="360"/>
+      </w:pPr>
+      <w:rPr>
+        <w:rFonts w:ascii="Wingdings" w:hAnsi="Wingdings" w:hint="default"/>
+      </w:rPr>
+    </w:lvl>
+    <w:lvl w:ilvl="6" w:tplc="04160001" w:tentative="1">
+      <w:start w:val="1"/>
+      <w:numFmt w:val="bullet"/>
+      <w:lvlText w:val=""/>
+      <w:lvlJc w:val="left"/>
+      <w:pPr>
+        <w:ind w:left="6120" w:hanging="360"/>
+      </w:pPr>
+      <w:rPr>
+        <w:rFonts w:ascii="Symbol" w:hAnsi="Symbol" w:hint="default"/>
+      </w:rPr>
+    </w:lvl>
+    <w:lvl w:ilvl="7" w:tplc="04160003" w:tentative="1">
+      <w:start w:val="1"/>
+      <w:numFmt w:val="bullet"/>
+      <w:lvlText w:val="o"/>
+      <w:lvlJc w:val="left"/>
+      <w:pPr>
+        <w:ind w:left="6840" w:hanging="360"/>
+      </w:pPr>
+      <w:rPr>
+        <w:rFonts w:ascii="Courier New" w:hAnsi="Courier New" w:cs="Courier New" w:hint="default"/>
+      </w:rPr>
+    </w:lvl>
+    <w:lvl w:ilvl="8" w:tplc="04160005" w:tentative="1">
+      <w:start w:val="1"/>
+      <w:numFmt w:val="bullet"/>
+      <w:lvlText w:val=""/>
+      <w:lvlJc w:val="left"/>
+      <w:pPr>
+        <w:ind w:left="7560" w:hanging="360"/>
+      </w:pPr>
+      <w:rPr>
+        <w:rFonts w:ascii="Wingdings" w:hAnsi="Wingdings" w:hint="default"/>
+      </w:rPr>
+    </w:lvl>
+  </w:abstractNum>
+  <w:abstractNum w:abstractNumId="3" w15:restartNumberingAfterBreak="0">
     <w:nsid w:val="159364AE"/>
     <w:multiLevelType w:val="hybridMultilevel"/>
     <w:tmpl w:val="5860C3A2"/>
@@ -1874,7 +2201,7 @@
       </w:rPr>
     </w:lvl>
   </w:abstractNum>
-  <w:abstractNum w:abstractNumId="3" w15:restartNumberingAfterBreak="0">
+  <w:abstractNum w:abstractNumId="4" w15:restartNumberingAfterBreak="0">
     <w:nsid w:val="26F538C8"/>
     <w:multiLevelType w:val="hybridMultilevel"/>
     <w:tmpl w:val="C8F604CC"/>
@@ -1987,7 +2314,7 @@
       </w:rPr>
     </w:lvl>
   </w:abstractNum>
-  <w:abstractNum w:abstractNumId="4" w15:restartNumberingAfterBreak="0">
+  <w:abstractNum w:abstractNumId="5" w15:restartNumberingAfterBreak="0">
     <w:nsid w:val="2B034796"/>
     <w:multiLevelType w:val="multilevel"/>
     <w:tmpl w:val="FA4E0BDA"/>
@@ -2136,7 +2463,7 @@
       </w:rPr>
     </w:lvl>
   </w:abstractNum>
-  <w:abstractNum w:abstractNumId="5" w15:restartNumberingAfterBreak="0">
+  <w:abstractNum w:abstractNumId="6" w15:restartNumberingAfterBreak="0">
     <w:nsid w:val="472F22A0"/>
     <w:multiLevelType w:val="hybridMultilevel"/>
     <w:tmpl w:val="16041DF4"/>
@@ -2249,7 +2576,7 @@
       </w:rPr>
     </w:lvl>
   </w:abstractNum>
-  <w:abstractNum w:abstractNumId="6" w15:restartNumberingAfterBreak="0">
+  <w:abstractNum w:abstractNumId="7" w15:restartNumberingAfterBreak="0">
     <w:nsid w:val="4F570791"/>
     <w:multiLevelType w:val="hybridMultilevel"/>
     <w:tmpl w:val="AC16414A"/>
@@ -2362,7 +2689,7 @@
       </w:rPr>
     </w:lvl>
   </w:abstractNum>
-  <w:abstractNum w:abstractNumId="7" w15:restartNumberingAfterBreak="0">
+  <w:abstractNum w:abstractNumId="8" w15:restartNumberingAfterBreak="0">
     <w:nsid w:val="59F859F3"/>
     <w:multiLevelType w:val="hybridMultilevel"/>
     <w:tmpl w:val="249CFC3A"/>
@@ -2475,7 +2802,7 @@
       </w:rPr>
     </w:lvl>
   </w:abstractNum>
-  <w:abstractNum w:abstractNumId="8" w15:restartNumberingAfterBreak="0">
+  <w:abstractNum w:abstractNumId="9" w15:restartNumberingAfterBreak="0">
     <w:nsid w:val="5FDA6FE2"/>
     <w:multiLevelType w:val="hybridMultilevel"/>
     <w:tmpl w:val="906E5562"/>
@@ -2588,7 +2915,7 @@
       </w:rPr>
     </w:lvl>
   </w:abstractNum>
-  <w:abstractNum w:abstractNumId="9" w15:restartNumberingAfterBreak="0">
+  <w:abstractNum w:abstractNumId="10" w15:restartNumberingAfterBreak="0">
     <w:nsid w:val="626E5EF9"/>
     <w:multiLevelType w:val="hybridMultilevel"/>
     <w:tmpl w:val="E6EA22D8"/>
@@ -2701,7 +3028,7 @@
       </w:rPr>
     </w:lvl>
   </w:abstractNum>
-  <w:abstractNum w:abstractNumId="10" w15:restartNumberingAfterBreak="0">
+  <w:abstractNum w:abstractNumId="11" w15:restartNumberingAfterBreak="0">
     <w:nsid w:val="72144198"/>
     <w:multiLevelType w:val="hybridMultilevel"/>
     <w:tmpl w:val="2F8EE2EA"/>
@@ -2814,7 +3141,7 @@
       </w:rPr>
     </w:lvl>
   </w:abstractNum>
-  <w:abstractNum w:abstractNumId="11" w15:restartNumberingAfterBreak="0">
+  <w:abstractNum w:abstractNumId="12" w15:restartNumberingAfterBreak="0">
     <w:nsid w:val="734B45EA"/>
     <w:multiLevelType w:val="hybridMultilevel"/>
     <w:tmpl w:val="A4303350"/>
@@ -2927,7 +3254,7 @@
       </w:rPr>
     </w:lvl>
   </w:abstractNum>
-  <w:abstractNum w:abstractNumId="12" w15:restartNumberingAfterBreak="0">
+  <w:abstractNum w:abstractNumId="13" w15:restartNumberingAfterBreak="0">
     <w:nsid w:val="7CCD0580"/>
     <w:multiLevelType w:val="hybridMultilevel"/>
     <w:tmpl w:val="654A433A"/>
@@ -3041,43 +3368,46 @@
     </w:lvl>
   </w:abstractNum>
   <w:num w:numId="1" w16cid:durableId="327178653">
-    <w:abstractNumId w:val="4"/>
+    <w:abstractNumId w:val="5"/>
   </w:num>
   <w:num w:numId="2" w16cid:durableId="1116749753">
-    <w:abstractNumId w:val="9"/>
+    <w:abstractNumId w:val="10"/>
   </w:num>
   <w:num w:numId="3" w16cid:durableId="1278635370">
-    <w:abstractNumId w:val="6"/>
+    <w:abstractNumId w:val="7"/>
   </w:num>
   <w:num w:numId="4" w16cid:durableId="536890993">
-    <w:abstractNumId w:val="2"/>
+    <w:abstractNumId w:val="3"/>
   </w:num>
   <w:num w:numId="5" w16cid:durableId="283538252">
-    <w:abstractNumId w:val="11"/>
+    <w:abstractNumId w:val="12"/>
   </w:num>
   <w:num w:numId="6" w16cid:durableId="583998794">
-    <w:abstractNumId w:val="7"/>
+    <w:abstractNumId w:val="8"/>
   </w:num>
   <w:num w:numId="7" w16cid:durableId="1443644440">
     <w:abstractNumId w:val="1"/>
   </w:num>
   <w:num w:numId="8" w16cid:durableId="227692456">
-    <w:abstractNumId w:val="3"/>
+    <w:abstractNumId w:val="4"/>
   </w:num>
   <w:num w:numId="9" w16cid:durableId="30882315">
-    <w:abstractNumId w:val="10"/>
+    <w:abstractNumId w:val="11"/>
   </w:num>
   <w:num w:numId="10" w16cid:durableId="254750007">
-    <w:abstractNumId w:val="8"/>
+    <w:abstractNumId w:val="9"/>
   </w:num>
   <w:num w:numId="11" w16cid:durableId="1106383102">
     <w:abstractNumId w:val="0"/>
   </w:num>
   <w:num w:numId="12" w16cid:durableId="485587841">
-    <w:abstractNumId w:val="5"/>
+    <w:abstractNumId w:val="6"/>
   </w:num>
   <w:num w:numId="13" w16cid:durableId="285354349">
-    <w:abstractNumId w:val="12"/>
+    <w:abstractNumId w:val="13"/>
+  </w:num>
+  <w:num w:numId="14" w16cid:durableId="2106874932">
+    <w:abstractNumId w:val="2"/>
   </w:num>
 </w:numbering>
 </file>
@@ -3483,11 +3813,11 @@
     <w:name w:val="Normal"/>
     <w:qFormat/>
   </w:style>
-  <w:style w:type="paragraph" w:styleId="Heading1">
+  <w:style w:type="paragraph" w:styleId="Ttulo1">
     <w:name w:val="heading 1"/>
     <w:basedOn w:val="Normal"/>
     <w:next w:val="Normal"/>
-    <w:link w:val="Heading1Char"/>
+    <w:link w:val="Ttulo1Char"/>
     <w:uiPriority w:val="9"/>
     <w:qFormat/>
     <w:rsid w:val="007353B3"/>
@@ -3504,11 +3834,11 @@
       <w:szCs w:val="40"/>
     </w:rPr>
   </w:style>
-  <w:style w:type="paragraph" w:styleId="Heading2">
+  <w:style w:type="paragraph" w:styleId="Ttulo2">
     <w:name w:val="heading 2"/>
     <w:basedOn w:val="Normal"/>
     <w:next w:val="Normal"/>
-    <w:link w:val="Heading2Char"/>
+    <w:link w:val="Ttulo2Char"/>
     <w:uiPriority w:val="9"/>
     <w:semiHidden/>
     <w:unhideWhenUsed/>
@@ -3527,11 +3857,11 @@
       <w:szCs w:val="32"/>
     </w:rPr>
   </w:style>
-  <w:style w:type="paragraph" w:styleId="Heading3">
+  <w:style w:type="paragraph" w:styleId="Ttulo3">
     <w:name w:val="heading 3"/>
     <w:basedOn w:val="Normal"/>
     <w:next w:val="Normal"/>
-    <w:link w:val="Heading3Char"/>
+    <w:link w:val="Ttulo3Char"/>
     <w:uiPriority w:val="9"/>
     <w:semiHidden/>
     <w:unhideWhenUsed/>
@@ -3550,11 +3880,11 @@
       <w:szCs w:val="28"/>
     </w:rPr>
   </w:style>
-  <w:style w:type="paragraph" w:styleId="Heading4">
+  <w:style w:type="paragraph" w:styleId="Ttulo4">
     <w:name w:val="heading 4"/>
     <w:basedOn w:val="Normal"/>
     <w:next w:val="Normal"/>
-    <w:link w:val="Heading4Char"/>
+    <w:link w:val="Ttulo4Char"/>
     <w:uiPriority w:val="9"/>
     <w:semiHidden/>
     <w:unhideWhenUsed/>
@@ -3573,11 +3903,11 @@
       <w:color w:val="0F4761" w:themeColor="accent1" w:themeShade="BF"/>
     </w:rPr>
   </w:style>
-  <w:style w:type="paragraph" w:styleId="Heading5">
+  <w:style w:type="paragraph" w:styleId="Ttulo5">
     <w:name w:val="heading 5"/>
     <w:basedOn w:val="Normal"/>
     <w:next w:val="Normal"/>
-    <w:link w:val="Heading5Char"/>
+    <w:link w:val="Ttulo5Char"/>
     <w:uiPriority w:val="9"/>
     <w:semiHidden/>
     <w:unhideWhenUsed/>
@@ -3594,11 +3924,11 @@
       <w:color w:val="0F4761" w:themeColor="accent1" w:themeShade="BF"/>
     </w:rPr>
   </w:style>
-  <w:style w:type="paragraph" w:styleId="Heading6">
+  <w:style w:type="paragraph" w:styleId="Ttulo6">
     <w:name w:val="heading 6"/>
     <w:basedOn w:val="Normal"/>
     <w:next w:val="Normal"/>
-    <w:link w:val="Heading6Char"/>
+    <w:link w:val="Ttulo6Char"/>
     <w:uiPriority w:val="9"/>
     <w:semiHidden/>
     <w:unhideWhenUsed/>
@@ -3617,11 +3947,11 @@
       <w:color w:val="595959" w:themeColor="text1" w:themeTint="A6"/>
     </w:rPr>
   </w:style>
-  <w:style w:type="paragraph" w:styleId="Heading7">
+  <w:style w:type="paragraph" w:styleId="Ttulo7">
     <w:name w:val="heading 7"/>
     <w:basedOn w:val="Normal"/>
     <w:next w:val="Normal"/>
-    <w:link w:val="Heading7Char"/>
+    <w:link w:val="Ttulo7Char"/>
     <w:uiPriority w:val="9"/>
     <w:semiHidden/>
     <w:unhideWhenUsed/>
@@ -3638,11 +3968,11 @@
       <w:color w:val="595959" w:themeColor="text1" w:themeTint="A6"/>
     </w:rPr>
   </w:style>
-  <w:style w:type="paragraph" w:styleId="Heading8">
+  <w:style w:type="paragraph" w:styleId="Ttulo8">
     <w:name w:val="heading 8"/>
     <w:basedOn w:val="Normal"/>
     <w:next w:val="Normal"/>
-    <w:link w:val="Heading8Char"/>
+    <w:link w:val="Ttulo8Char"/>
     <w:uiPriority w:val="9"/>
     <w:semiHidden/>
     <w:unhideWhenUsed/>
@@ -3661,11 +3991,11 @@
       <w:color w:val="272727" w:themeColor="text1" w:themeTint="D8"/>
     </w:rPr>
   </w:style>
-  <w:style w:type="paragraph" w:styleId="Heading9">
+  <w:style w:type="paragraph" w:styleId="Ttulo9">
     <w:name w:val="heading 9"/>
     <w:basedOn w:val="Normal"/>
     <w:next w:val="Normal"/>
-    <w:link w:val="Heading9Char"/>
+    <w:link w:val="Ttulo9Char"/>
     <w:uiPriority w:val="9"/>
     <w:semiHidden/>
     <w:unhideWhenUsed/>
@@ -3682,13 +4012,12 @@
       <w:color w:val="272727" w:themeColor="text1" w:themeTint="D8"/>
     </w:rPr>
   </w:style>
-  <w:style w:type="character" w:default="1" w:styleId="DefaultParagraphFont">
+  <w:style w:type="character" w:default="1" w:styleId="Fontepargpadro">
     <w:name w:val="Default Paragraph Font"/>
     <w:uiPriority w:val="1"/>
-    <w:semiHidden/>
     <w:unhideWhenUsed/>
   </w:style>
-  <w:style w:type="table" w:default="1" w:styleId="TableNormal">
+  <w:style w:type="table" w:default="1" w:styleId="Tabelanormal">
     <w:name w:val="Normal Table"/>
     <w:uiPriority w:val="99"/>
     <w:semiHidden/>
@@ -3703,16 +4032,16 @@
       </w:tblCellMar>
     </w:tblPr>
   </w:style>
-  <w:style w:type="numbering" w:default="1" w:styleId="NoList">
+  <w:style w:type="numbering" w:default="1" w:styleId="Semlista">
     <w:name w:val="No List"/>
     <w:uiPriority w:val="99"/>
     <w:semiHidden/>
     <w:unhideWhenUsed/>
   </w:style>
-  <w:style w:type="character" w:customStyle="1" w:styleId="Heading1Char">
-    <w:name w:val="Heading 1 Char"/>
-    <w:basedOn w:val="DefaultParagraphFont"/>
-    <w:link w:val="Heading1"/>
+  <w:style w:type="character" w:customStyle="1" w:styleId="Ttulo1Char">
+    <w:name w:val="Título 1 Char"/>
+    <w:basedOn w:val="Fontepargpadro"/>
+    <w:link w:val="Ttulo1"/>
     <w:uiPriority w:val="9"/>
     <w:rsid w:val="007353B3"/>
     <w:rPr>
@@ -3722,10 +4051,10 @@
       <w:szCs w:val="40"/>
     </w:rPr>
   </w:style>
-  <w:style w:type="character" w:customStyle="1" w:styleId="Heading2Char">
-    <w:name w:val="Heading 2 Char"/>
-    <w:basedOn w:val="DefaultParagraphFont"/>
-    <w:link w:val="Heading2"/>
+  <w:style w:type="character" w:customStyle="1" w:styleId="Ttulo2Char">
+    <w:name w:val="Título 2 Char"/>
+    <w:basedOn w:val="Fontepargpadro"/>
+    <w:link w:val="Ttulo2"/>
     <w:uiPriority w:val="9"/>
     <w:semiHidden/>
     <w:rsid w:val="007353B3"/>
@@ -3736,10 +4065,10 @@
       <w:szCs w:val="32"/>
     </w:rPr>
   </w:style>
-  <w:style w:type="character" w:customStyle="1" w:styleId="Heading3Char">
-    <w:name w:val="Heading 3 Char"/>
-    <w:basedOn w:val="DefaultParagraphFont"/>
-    <w:link w:val="Heading3"/>
+  <w:style w:type="character" w:customStyle="1" w:styleId="Ttulo3Char">
+    <w:name w:val="Título 3 Char"/>
+    <w:basedOn w:val="Fontepargpadro"/>
+    <w:link w:val="Ttulo3"/>
     <w:uiPriority w:val="9"/>
     <w:semiHidden/>
     <w:rsid w:val="007353B3"/>
@@ -3750,10 +4079,10 @@
       <w:szCs w:val="28"/>
     </w:rPr>
   </w:style>
-  <w:style w:type="character" w:customStyle="1" w:styleId="Heading4Char">
-    <w:name w:val="Heading 4 Char"/>
-    <w:basedOn w:val="DefaultParagraphFont"/>
-    <w:link w:val="Heading4"/>
+  <w:style w:type="character" w:customStyle="1" w:styleId="Ttulo4Char">
+    <w:name w:val="Título 4 Char"/>
+    <w:basedOn w:val="Fontepargpadro"/>
+    <w:link w:val="Ttulo4"/>
     <w:uiPriority w:val="9"/>
     <w:semiHidden/>
     <w:rsid w:val="007353B3"/>
@@ -3764,10 +4093,10 @@
       <w:color w:val="0F4761" w:themeColor="accent1" w:themeShade="BF"/>
     </w:rPr>
   </w:style>
-  <w:style w:type="character" w:customStyle="1" w:styleId="Heading5Char">
-    <w:name w:val="Heading 5 Char"/>
-    <w:basedOn w:val="DefaultParagraphFont"/>
-    <w:link w:val="Heading5"/>
+  <w:style w:type="character" w:customStyle="1" w:styleId="Ttulo5Char">
+    <w:name w:val="Título 5 Char"/>
+    <w:basedOn w:val="Fontepargpadro"/>
+    <w:link w:val="Ttulo5"/>
     <w:uiPriority w:val="9"/>
     <w:semiHidden/>
     <w:rsid w:val="007353B3"/>
@@ -3776,10 +4105,10 @@
       <w:color w:val="0F4761" w:themeColor="accent1" w:themeShade="BF"/>
     </w:rPr>
   </w:style>
-  <w:style w:type="character" w:customStyle="1" w:styleId="Heading6Char">
-    <w:name w:val="Heading 6 Char"/>
-    <w:basedOn w:val="DefaultParagraphFont"/>
-    <w:link w:val="Heading6"/>
+  <w:style w:type="character" w:customStyle="1" w:styleId="Ttulo6Char">
+    <w:name w:val="Título 6 Char"/>
+    <w:basedOn w:val="Fontepargpadro"/>
+    <w:link w:val="Ttulo6"/>
     <w:uiPriority w:val="9"/>
     <w:semiHidden/>
     <w:rsid w:val="007353B3"/>
@@ -3790,10 +4119,10 @@
       <w:color w:val="595959" w:themeColor="text1" w:themeTint="A6"/>
     </w:rPr>
   </w:style>
-  <w:style w:type="character" w:customStyle="1" w:styleId="Heading7Char">
-    <w:name w:val="Heading 7 Char"/>
-    <w:basedOn w:val="DefaultParagraphFont"/>
-    <w:link w:val="Heading7"/>
+  <w:style w:type="character" w:customStyle="1" w:styleId="Ttulo7Char">
+    <w:name w:val="Título 7 Char"/>
+    <w:basedOn w:val="Fontepargpadro"/>
+    <w:link w:val="Ttulo7"/>
     <w:uiPriority w:val="9"/>
     <w:semiHidden/>
     <w:rsid w:val="007353B3"/>
@@ -3802,10 +4131,10 @@
       <w:color w:val="595959" w:themeColor="text1" w:themeTint="A6"/>
     </w:rPr>
   </w:style>
-  <w:style w:type="character" w:customStyle="1" w:styleId="Heading8Char">
-    <w:name w:val="Heading 8 Char"/>
-    <w:basedOn w:val="DefaultParagraphFont"/>
-    <w:link w:val="Heading8"/>
+  <w:style w:type="character" w:customStyle="1" w:styleId="Ttulo8Char">
+    <w:name w:val="Título 8 Char"/>
+    <w:basedOn w:val="Fontepargpadro"/>
+    <w:link w:val="Ttulo8"/>
     <w:uiPriority w:val="9"/>
     <w:semiHidden/>
     <w:rsid w:val="007353B3"/>
@@ -3816,10 +4145,10 @@
       <w:color w:val="272727" w:themeColor="text1" w:themeTint="D8"/>
     </w:rPr>
   </w:style>
-  <w:style w:type="character" w:customStyle="1" w:styleId="Heading9Char">
-    <w:name w:val="Heading 9 Char"/>
-    <w:basedOn w:val="DefaultParagraphFont"/>
-    <w:link w:val="Heading9"/>
+  <w:style w:type="character" w:customStyle="1" w:styleId="Ttulo9Char">
+    <w:name w:val="Título 9 Char"/>
+    <w:basedOn w:val="Fontepargpadro"/>
+    <w:link w:val="Ttulo9"/>
     <w:uiPriority w:val="9"/>
     <w:semiHidden/>
     <w:rsid w:val="007353B3"/>
@@ -3828,11 +4157,11 @@
       <w:color w:val="272727" w:themeColor="text1" w:themeTint="D8"/>
     </w:rPr>
   </w:style>
-  <w:style w:type="paragraph" w:styleId="Title">
+  <w:style w:type="paragraph" w:styleId="Ttulo">
     <w:name w:val="Title"/>
     <w:basedOn w:val="Normal"/>
     <w:next w:val="Normal"/>
-    <w:link w:val="TitleChar"/>
+    <w:link w:val="TtuloChar"/>
     <w:uiPriority w:val="10"/>
     <w:qFormat/>
     <w:rsid w:val="007353B3"/>
@@ -3848,10 +4177,10 @@
       <w:szCs w:val="56"/>
     </w:rPr>
   </w:style>
-  <w:style w:type="character" w:customStyle="1" w:styleId="TitleChar">
-    <w:name w:val="Title Char"/>
-    <w:basedOn w:val="DefaultParagraphFont"/>
-    <w:link w:val="Title"/>
+  <w:style w:type="character" w:customStyle="1" w:styleId="TtuloChar">
+    <w:name w:val="Título Char"/>
+    <w:basedOn w:val="Fontepargpadro"/>
+    <w:link w:val="Ttulo"/>
     <w:uiPriority w:val="10"/>
     <w:rsid w:val="007353B3"/>
     <w:rPr>
@@ -3862,11 +4191,11 @@
       <w:szCs w:val="56"/>
     </w:rPr>
   </w:style>
-  <w:style w:type="paragraph" w:styleId="Subtitle">
+  <w:style w:type="paragraph" w:styleId="Subttulo">
     <w:name w:val="Subtitle"/>
     <w:basedOn w:val="Normal"/>
     <w:next w:val="Normal"/>
-    <w:link w:val="SubtitleChar"/>
+    <w:link w:val="SubttuloChar"/>
     <w:uiPriority w:val="11"/>
     <w:qFormat/>
     <w:rsid w:val="007353B3"/>
@@ -3883,10 +4212,10 @@
       <w:szCs w:val="28"/>
     </w:rPr>
   </w:style>
-  <w:style w:type="character" w:customStyle="1" w:styleId="SubtitleChar">
-    <w:name w:val="Subtitle Char"/>
-    <w:basedOn w:val="DefaultParagraphFont"/>
-    <w:link w:val="Subtitle"/>
+  <w:style w:type="character" w:customStyle="1" w:styleId="SubttuloChar">
+    <w:name w:val="Subtítulo Char"/>
+    <w:basedOn w:val="Fontepargpadro"/>
+    <w:link w:val="Subttulo"/>
     <w:uiPriority w:val="11"/>
     <w:rsid w:val="007353B3"/>
     <w:rPr>
@@ -3897,11 +4226,11 @@
       <w:szCs w:val="28"/>
     </w:rPr>
   </w:style>
-  <w:style w:type="paragraph" w:styleId="Quote">
+  <w:style w:type="paragraph" w:styleId="Citao">
     <w:name w:val="Quote"/>
     <w:basedOn w:val="Normal"/>
     <w:next w:val="Normal"/>
-    <w:link w:val="QuoteChar"/>
+    <w:link w:val="CitaoChar"/>
     <w:uiPriority w:val="29"/>
     <w:qFormat/>
     <w:rsid w:val="007353B3"/>
@@ -3915,10 +4244,10 @@
       <w:color w:val="404040" w:themeColor="text1" w:themeTint="BF"/>
     </w:rPr>
   </w:style>
-  <w:style w:type="character" w:customStyle="1" w:styleId="QuoteChar">
-    <w:name w:val="Quote Char"/>
-    <w:basedOn w:val="DefaultParagraphFont"/>
-    <w:link w:val="Quote"/>
+  <w:style w:type="character" w:customStyle="1" w:styleId="CitaoChar">
+    <w:name w:val="Citação Char"/>
+    <w:basedOn w:val="Fontepargpadro"/>
+    <w:link w:val="Citao"/>
     <w:uiPriority w:val="29"/>
     <w:rsid w:val="007353B3"/>
     <w:rPr>
@@ -3927,7 +4256,7 @@
       <w:color w:val="404040" w:themeColor="text1" w:themeTint="BF"/>
     </w:rPr>
   </w:style>
-  <w:style w:type="paragraph" w:styleId="ListParagraph">
+  <w:style w:type="paragraph" w:styleId="PargrafodaLista">
     <w:name w:val="List Paragraph"/>
     <w:basedOn w:val="Normal"/>
     <w:uiPriority w:val="34"/>
@@ -3938,9 +4267,9 @@
       <w:contextualSpacing/>
     </w:pPr>
   </w:style>
-  <w:style w:type="character" w:styleId="IntenseEmphasis">
+  <w:style w:type="character" w:styleId="nfaseIntensa">
     <w:name w:val="Intense Emphasis"/>
-    <w:basedOn w:val="DefaultParagraphFont"/>
+    <w:basedOn w:val="Fontepargpadro"/>
     <w:uiPriority w:val="21"/>
     <w:qFormat/>
     <w:rsid w:val="007353B3"/>
@@ -3950,11 +4279,11 @@
       <w:color w:val="0F4761" w:themeColor="accent1" w:themeShade="BF"/>
     </w:rPr>
   </w:style>
-  <w:style w:type="paragraph" w:styleId="IntenseQuote">
+  <w:style w:type="paragraph" w:styleId="CitaoIntensa">
     <w:name w:val="Intense Quote"/>
     <w:basedOn w:val="Normal"/>
     <w:next w:val="Normal"/>
-    <w:link w:val="IntenseQuoteChar"/>
+    <w:link w:val="CitaoIntensaChar"/>
     <w:uiPriority w:val="30"/>
     <w:qFormat/>
     <w:rsid w:val="007353B3"/>
@@ -3973,10 +4302,10 @@
       <w:color w:val="0F4761" w:themeColor="accent1" w:themeShade="BF"/>
     </w:rPr>
   </w:style>
-  <w:style w:type="character" w:customStyle="1" w:styleId="IntenseQuoteChar">
-    <w:name w:val="Intense Quote Char"/>
-    <w:basedOn w:val="DefaultParagraphFont"/>
-    <w:link w:val="IntenseQuote"/>
+  <w:style w:type="character" w:customStyle="1" w:styleId="CitaoIntensaChar">
+    <w:name w:val="Citação Intensa Char"/>
+    <w:basedOn w:val="Fontepargpadro"/>
+    <w:link w:val="CitaoIntensa"/>
     <w:uiPriority w:val="30"/>
     <w:rsid w:val="007353B3"/>
     <w:rPr>
@@ -3985,9 +4314,9 @@
       <w:color w:val="0F4761" w:themeColor="accent1" w:themeShade="BF"/>
     </w:rPr>
   </w:style>
-  <w:style w:type="character" w:styleId="IntenseReference">
+  <w:style w:type="character" w:styleId="RefernciaIntensa">
     <w:name w:val="Intense Reference"/>
-    <w:basedOn w:val="DefaultParagraphFont"/>
+    <w:basedOn w:val="Fontepargpadro"/>
     <w:uiPriority w:val="32"/>
     <w:qFormat/>
     <w:rsid w:val="007353B3"/>
@@ -3999,7 +4328,7 @@
       <w:spacing w:val="5"/>
     </w:rPr>
   </w:style>
-  <w:style w:type="paragraph" w:styleId="NoSpacing">
+  <w:style w:type="paragraph" w:styleId="SemEspaamento">
     <w:name w:val="No Spacing"/>
     <w:uiPriority w:val="1"/>
     <w:qFormat/>
@@ -4025,11 +4354,11 @@
       <w14:ligatures w14:val="none"/>
     </w:rPr>
   </w:style>
-  <w:style w:type="paragraph" w:styleId="z-TopofForm">
+  <w:style w:type="paragraph" w:styleId="Partesuperior-zdoformulrio">
     <w:name w:val="HTML Top of Form"/>
     <w:basedOn w:val="Normal"/>
     <w:next w:val="Normal"/>
-    <w:link w:val="z-TopofFormChar"/>
+    <w:link w:val="Partesuperior-zdoformulrioChar"/>
     <w:hidden/>
     <w:uiPriority w:val="99"/>
     <w:semiHidden/>
@@ -4052,10 +4381,10 @@
       <w14:ligatures w14:val="none"/>
     </w:rPr>
   </w:style>
-  <w:style w:type="character" w:customStyle="1" w:styleId="z-TopofFormChar">
-    <w:name w:val="z-Top of Form Char"/>
-    <w:basedOn w:val="DefaultParagraphFont"/>
-    <w:link w:val="z-TopofForm"/>
+  <w:style w:type="character" w:customStyle="1" w:styleId="Partesuperior-zdoformulrioChar">
+    <w:name w:val="Parte superior-z do formulário Char"/>
+    <w:basedOn w:val="Fontepargpadro"/>
+    <w:link w:val="Partesuperior-zdoformulrio"/>
     <w:uiPriority w:val="99"/>
     <w:semiHidden/>
     <w:rsid w:val="009B554B"/>
@@ -4071,7 +4400,7 @@
   </w:style>
   <w:style w:type="character" w:styleId="Hyperlink">
     <w:name w:val="Hyperlink"/>
-    <w:basedOn w:val="DefaultParagraphFont"/>
+    <w:basedOn w:val="Fontepargpadro"/>
     <w:uiPriority w:val="99"/>
     <w:unhideWhenUsed/>
     <w:rsid w:val="009918FB"/>
@@ -4080,9 +4409,9 @@
       <w:u w:val="single"/>
     </w:rPr>
   </w:style>
-  <w:style w:type="character" w:styleId="UnresolvedMention">
+  <w:style w:type="character" w:styleId="MenoPendente">
     <w:name w:val="Unresolved Mention"/>
-    <w:basedOn w:val="DefaultParagraphFont"/>
+    <w:basedOn w:val="Fontepargpadro"/>
     <w:uiPriority w:val="99"/>
     <w:semiHidden/>
     <w:unhideWhenUsed/>

</xml_diff>